<commit_message>
Update Readme for tokenization inclusion
</commit_message>
<xml_diff>
--- a/Secure-Retail-Data-Lakehouse/documentation/Secure_Retail_Data_Lakehouse_Report.docx
+++ b/Secure-Retail-Data-Lakehouse/documentation/Secure_Retail_Data_Lakehouse_Report.docx
@@ -380,24 +380,29 @@
         <w:rPr>
           <w:color w:val="222222"/>
         </w:rPr>
-        <w:t>Silver Layer applies privacy-preserving transformations such as masking and redaction of personally identifiable information.</w:t>
-      </w:r>
-    </w:p>
-    <w:p>
-      <w:pPr>
-        <w:pStyle w:val="ListParagraph"/>
-        <w:numPr>
-          <w:ilvl w:val="0"/>
-          <w:numId w:val="2"/>
-        </w:numPr>
-        <w:spacing w:after="100" w:line="276" w:lineRule="auto"/>
-        <w:jc w:val="both"/>
-      </w:pPr>
-      <w:r>
-        <w:rPr>
-          <w:color w:val="222222"/>
-        </w:rPr>
-        <w:t>Gold Layer prepares analytics-ready datasets through feature engineering, customer segmentation, transaction bucketing, and summary generation.</w:t>
+        <w:t xml:space="preserve">Silver Layer applies privacy-preserving transformations including masking, redaction, and salted SHA-256 tokenization of selected customer identifiers. The Gold Layer further generalizes customer information by deriving age groups, removing the exact date of birth, and generalizing postal codes before exposing datasets for </w:t>
+      </w:r>
+      <w:proofErr w:type="spellStart"/>
+      <w:proofErr w:type="gramStart"/>
+      <w:r>
+        <w:rPr>
+          <w:color w:val="222222"/>
+        </w:rPr>
+        <w:t>analytics.</w:t>
+      </w:r>
+      <w:r>
+        <w:rPr>
+          <w:color w:val="222222"/>
+        </w:rPr>
+        <w:t>Gold</w:t>
+      </w:r>
+      <w:proofErr w:type="spellEnd"/>
+      <w:proofErr w:type="gramEnd"/>
+      <w:r>
+        <w:rPr>
+          <w:color w:val="222222"/>
+        </w:rPr>
+        <w:t xml:space="preserve"> Layer prepares analytics-ready datasets through feature engineering, customer segmentation, transaction bucketing, and summary generation.</w:t>
       </w:r>
     </w:p>
     <w:p>
@@ -869,7 +874,41 @@
         <w:rPr>
           <w:color w:val="222222"/>
         </w:rPr>
-        <w:t>To implement data masking and redaction techniques for Personally Identifiable Information (PII).</w:t>
+        <w:t xml:space="preserve">To implement </w:t>
+      </w:r>
+      <w:proofErr w:type="spellStart"/>
+      <w:r>
+        <w:rPr>
+          <w:color w:val="222222"/>
+        </w:rPr>
+        <w:t>Implement</w:t>
+      </w:r>
+      <w:proofErr w:type="spellEnd"/>
+      <w:r>
+        <w:rPr>
+          <w:color w:val="222222"/>
+        </w:rPr>
+        <w:t xml:space="preserve"> masking, redaction, cryptographic tokenization, and data generalization techniques for Personally Identifiable Information (PII</w:t>
+      </w:r>
+      <w:proofErr w:type="gramStart"/>
+      <w:r>
+        <w:rPr>
+          <w:color w:val="222222"/>
+        </w:rPr>
+        <w:t>).</w:t>
+      </w:r>
+      <w:r>
+        <w:rPr>
+          <w:color w:val="222222"/>
+        </w:rPr>
+        <w:t>techniques</w:t>
+      </w:r>
+      <w:proofErr w:type="gramEnd"/>
+      <w:r>
+        <w:rPr>
+          <w:color w:val="222222"/>
+        </w:rPr>
+        <w:t xml:space="preserve"> for Personally Identifiable Information (PII).</w:t>
       </w:r>
     </w:p>
     <w:p>
@@ -1030,12 +1069,6 @@
         <w:gridCol w:w="6600"/>
       </w:tblGrid>
       <w:tr>
-        <w:tblPrEx>
-          <w:tblCellMar>
-            <w:top w:w="0" w:type="dxa"/>
-            <w:bottom w:w="0" w:type="dxa"/>
-          </w:tblCellMar>
-        </w:tblPrEx>
         <w:tc>
           <w:tcPr>
             <w:tcW w:w="2400" w:type="dxa"/>
@@ -1088,12 +1121,6 @@
         </w:tc>
       </w:tr>
       <w:tr>
-        <w:tblPrEx>
-          <w:tblCellMar>
-            <w:top w:w="0" w:type="dxa"/>
-            <w:bottom w:w="0" w:type="dxa"/>
-          </w:tblCellMar>
-        </w:tblPrEx>
         <w:tc>
           <w:tcPr>
             <w:tcW w:w="2400" w:type="dxa"/>
@@ -1138,12 +1165,6 @@
         </w:tc>
       </w:tr>
       <w:tr>
-        <w:tblPrEx>
-          <w:tblCellMar>
-            <w:top w:w="0" w:type="dxa"/>
-            <w:bottom w:w="0" w:type="dxa"/>
-          </w:tblCellMar>
-        </w:tblPrEx>
         <w:tc>
           <w:tcPr>
             <w:tcW w:w="2400" w:type="dxa"/>
@@ -1188,12 +1209,6 @@
         </w:tc>
       </w:tr>
       <w:tr>
-        <w:tblPrEx>
-          <w:tblCellMar>
-            <w:top w:w="0" w:type="dxa"/>
-            <w:bottom w:w="0" w:type="dxa"/>
-          </w:tblCellMar>
-        </w:tblPrEx>
         <w:tc>
           <w:tcPr>
             <w:tcW w:w="2400" w:type="dxa"/>
@@ -1238,12 +1253,6 @@
         </w:tc>
       </w:tr>
       <w:tr>
-        <w:tblPrEx>
-          <w:tblCellMar>
-            <w:top w:w="0" w:type="dxa"/>
-            <w:bottom w:w="0" w:type="dxa"/>
-          </w:tblCellMar>
-        </w:tblPrEx>
         <w:tc>
           <w:tcPr>
             <w:tcW w:w="2400" w:type="dxa"/>
@@ -1288,12 +1297,6 @@
         </w:tc>
       </w:tr>
       <w:tr>
-        <w:tblPrEx>
-          <w:tblCellMar>
-            <w:top w:w="0" w:type="dxa"/>
-            <w:bottom w:w="0" w:type="dxa"/>
-          </w:tblCellMar>
-        </w:tblPrEx>
         <w:tc>
           <w:tcPr>
             <w:tcW w:w="2400" w:type="dxa"/>
@@ -1340,12 +1343,6 @@
         </w:tc>
       </w:tr>
       <w:tr>
-        <w:tblPrEx>
-          <w:tblCellMar>
-            <w:top w:w="0" w:type="dxa"/>
-            <w:bottom w:w="0" w:type="dxa"/>
-          </w:tblCellMar>
-        </w:tblPrEx>
         <w:tc>
           <w:tcPr>
             <w:tcW w:w="2400" w:type="dxa"/>
@@ -1390,12 +1387,6 @@
         </w:tc>
       </w:tr>
       <w:tr>
-        <w:tblPrEx>
-          <w:tblCellMar>
-            <w:top w:w="0" w:type="dxa"/>
-            <w:bottom w:w="0" w:type="dxa"/>
-          </w:tblCellMar>
-        </w:tblPrEx>
         <w:tc>
           <w:tcPr>
             <w:tcW w:w="2400" w:type="dxa"/>
@@ -1440,12 +1431,6 @@
         </w:tc>
       </w:tr>
       <w:tr>
-        <w:tblPrEx>
-          <w:tblCellMar>
-            <w:top w:w="0" w:type="dxa"/>
-            <w:bottom w:w="0" w:type="dxa"/>
-          </w:tblCellMar>
-        </w:tblPrEx>
         <w:tc>
           <w:tcPr>
             <w:tcW w:w="2400" w:type="dxa"/>
@@ -1490,12 +1475,6 @@
         </w:tc>
       </w:tr>
       <w:tr>
-        <w:tblPrEx>
-          <w:tblCellMar>
-            <w:top w:w="0" w:type="dxa"/>
-            <w:bottom w:w="0" w:type="dxa"/>
-          </w:tblCellMar>
-        </w:tblPrEx>
         <w:tc>
           <w:tcPr>
             <w:tcW w:w="2400" w:type="dxa"/>
@@ -1539,23 +1518,134 @@
           </w:p>
         </w:tc>
       </w:tr>
+      <w:tr>
+        <w:tc>
+          <w:tcPr>
+            <w:tcW w:w="2400" w:type="dxa"/>
+            <w:tcMar>
+              <w:top w:w="100" w:type="dxa"/>
+              <w:left w:w="120" w:type="dxa"/>
+              <w:bottom w:w="100" w:type="dxa"/>
+              <w:right w:w="120" w:type="dxa"/>
+            </w:tcMar>
+            <w:vAlign w:val="center"/>
+          </w:tcPr>
+          <w:p>
+            <w:pPr>
+              <w:rPr>
+                <w:sz w:val="21"/>
+                <w:szCs w:val="21"/>
+              </w:rPr>
+            </w:pPr>
+            <w:proofErr w:type="spellStart"/>
+            <w:r>
+              <w:rPr>
+                <w:sz w:val="21"/>
+                <w:szCs w:val="21"/>
+              </w:rPr>
+              <w:t>hashlib</w:t>
+            </w:r>
+            <w:proofErr w:type="spellEnd"/>
+          </w:p>
+        </w:tc>
+        <w:tc>
+          <w:tcPr>
+            <w:tcW w:w="6600" w:type="dxa"/>
+            <w:tcMar>
+              <w:top w:w="100" w:type="dxa"/>
+              <w:left w:w="120" w:type="dxa"/>
+              <w:bottom w:w="100" w:type="dxa"/>
+              <w:right w:w="120" w:type="dxa"/>
+            </w:tcMar>
+            <w:vAlign w:val="center"/>
+          </w:tcPr>
+          <w:p>
+            <w:pPr>
+              <w:rPr>
+                <w:sz w:val="21"/>
+                <w:szCs w:val="21"/>
+              </w:rPr>
+            </w:pPr>
+            <w:r>
+              <w:rPr>
+                <w:sz w:val="21"/>
+                <w:szCs w:val="21"/>
+              </w:rPr>
+              <w:t>SHA-256 based cryptographic token generation</w:t>
+            </w:r>
+          </w:p>
+        </w:tc>
+      </w:tr>
+      <w:tr>
+        <w:tc>
+          <w:tcPr>
+            <w:tcW w:w="2400" w:type="dxa"/>
+            <w:tcMar>
+              <w:top w:w="100" w:type="dxa"/>
+              <w:left w:w="120" w:type="dxa"/>
+              <w:bottom w:w="100" w:type="dxa"/>
+              <w:right w:w="120" w:type="dxa"/>
+            </w:tcMar>
+            <w:vAlign w:val="center"/>
+          </w:tcPr>
+          <w:p>
+            <w:pPr>
+              <w:rPr>
+                <w:sz w:val="21"/>
+                <w:szCs w:val="21"/>
+              </w:rPr>
+            </w:pPr>
+            <w:r>
+              <w:rPr>
+                <w:sz w:val="21"/>
+                <w:szCs w:val="21"/>
+              </w:rPr>
+              <w:t>python-</w:t>
+            </w:r>
+            <w:proofErr w:type="spellStart"/>
+            <w:r>
+              <w:rPr>
+                <w:sz w:val="21"/>
+                <w:szCs w:val="21"/>
+              </w:rPr>
+              <w:t>dotenv</w:t>
+            </w:r>
+            <w:proofErr w:type="spellEnd"/>
+          </w:p>
+        </w:tc>
+        <w:tc>
+          <w:tcPr>
+            <w:tcW w:w="6600" w:type="dxa"/>
+            <w:tcMar>
+              <w:top w:w="100" w:type="dxa"/>
+              <w:left w:w="120" w:type="dxa"/>
+              <w:bottom w:w="100" w:type="dxa"/>
+              <w:right w:w="120" w:type="dxa"/>
+            </w:tcMar>
+            <w:vAlign w:val="center"/>
+          </w:tcPr>
+          <w:p>
+            <w:pPr>
+              <w:rPr>
+                <w:sz w:val="21"/>
+                <w:szCs w:val="21"/>
+              </w:rPr>
+            </w:pPr>
+            <w:r>
+              <w:rPr>
+                <w:sz w:val="21"/>
+                <w:szCs w:val="21"/>
+              </w:rPr>
+              <w:t>Secure management of database credentials and hashing salt using environment variables</w:t>
+            </w:r>
+          </w:p>
+        </w:tc>
+      </w:tr>
     </w:tbl>
     <w:p>
       <w:pPr>
         <w:spacing w:before="240"/>
       </w:pPr>
-    </w:p>
-    <w:p>
-      <w:pPr>
-        <w:spacing w:after="160" w:line="276" w:lineRule="auto"/>
-        <w:jc w:val="both"/>
-      </w:pPr>
-      <w:r>
-        <w:rPr>
-          <w:color w:val="222222"/>
-        </w:rPr>
-        <w:t>The selected technology stack provides a practical combination of open-source tools widely adopted in modern Data Engineering projects.</w:t>
-      </w:r>
     </w:p>
     <w:p>
       <w:pPr>
@@ -1708,33 +1798,53 @@
       <w:pPr>
         <w:spacing w:after="160" w:line="276" w:lineRule="auto"/>
         <w:jc w:val="both"/>
-      </w:pPr>
-      <w:r>
-        <w:rPr>
-          <w:color w:val="222222"/>
-        </w:rPr>
-        <w:t>The Silver Layer focuses on protecting Personally Identifiable Information (PII). Sensitive customer attributes such as names, phone numbers, email addresses, payment card numbers, and addresses are masked or redacted while preserving analytical usefulness.</w:t>
+        <w:rPr>
+          <w:color w:val="222222"/>
+        </w:rPr>
+      </w:pPr>
+      <w:r>
+        <w:rPr>
+          <w:color w:val="222222"/>
+        </w:rPr>
+        <w:t xml:space="preserve">The Silver Layer focuses on protecting Personally Identifiable Information (PII). </w:t>
+      </w:r>
+      <w:r>
+        <w:rPr>
+          <w:color w:val="222222"/>
+        </w:rPr>
+        <w:t>Sensitive customer attributes such as names, phone numbers, email addresses, payment card numbers, and addresses are protected using masking, redaction, and salted SHA-256 tokenization, allowing secure analytical joins without exposing the original identifiers.</w:t>
+      </w:r>
+    </w:p>
+    <w:p>
+      <w:pPr>
+        <w:spacing w:after="160" w:line="276" w:lineRule="auto"/>
+        <w:jc w:val="both"/>
+      </w:pPr>
+      <w:r>
+        <w:t>6. Gold Layer</w:t>
       </w:r>
     </w:p>
     <w:p>
       <w:pPr>
         <w:pStyle w:val="Heading3"/>
         <w:spacing w:before="200" w:after="100"/>
-      </w:pPr>
-      <w:r>
-        <w:t>6. Gold Layer</w:t>
-      </w:r>
-    </w:p>
-    <w:p>
-      <w:pPr>
-        <w:spacing w:after="160" w:line="276" w:lineRule="auto"/>
-        <w:jc w:val="both"/>
-      </w:pPr>
-      <w:r>
-        <w:rPr>
-          <w:color w:val="222222"/>
-        </w:rPr>
-        <w:t>The Gold Layer prepares analytics-ready datasets by performing feature engineering and aggregation. Customer age groups, transaction amount buckets, and summary datasets are generated to support downstream reporting and analysis.</w:t>
+        <w:rPr>
+          <w:b w:val="0"/>
+          <w:bCs w:val="0"/>
+          <w:color w:val="222222"/>
+          <w:sz w:val="22"/>
+          <w:szCs w:val="22"/>
+        </w:rPr>
+      </w:pPr>
+      <w:r>
+        <w:rPr>
+          <w:b w:val="0"/>
+          <w:bCs w:val="0"/>
+          <w:color w:val="222222"/>
+          <w:sz w:val="22"/>
+          <w:szCs w:val="22"/>
+        </w:rPr>
+        <w:t>The Gold Layer prepares analytics-ready datasets through feature engineering, customer segmentation, transaction bucketing, data generalization, and summary generation. Exact dates of birth are removed after deriving age and age group, while postal codes are generalized before exposure to downstream analytics.</w:t>
       </w:r>
     </w:p>
     <w:p>
@@ -1764,6 +1874,7 @@
         <w:spacing w:before="200" w:after="100"/>
       </w:pPr>
       <w:r>
+        <w:lastRenderedPageBreak/>
         <w:t>8. Automated Reporting</w:t>
       </w:r>
     </w:p>
@@ -1776,7 +1887,6 @@
         <w:rPr>
           <w:color w:val="222222"/>
         </w:rPr>
-        <w:lastRenderedPageBreak/>
         <w:t>After successful pipeline execution, automated reports are generated to summarize pipeline metrics, validate data quality, and provide an HTML overview of the pipeline execution.</w:t>
       </w:r>
     </w:p>
@@ -2833,12 +2943,6 @@
         <w:gridCol w:w="4500"/>
       </w:tblGrid>
       <w:tr>
-        <w:tblPrEx>
-          <w:tblCellMar>
-            <w:top w:w="0" w:type="dxa"/>
-            <w:bottom w:w="0" w:type="dxa"/>
-          </w:tblCellMar>
-        </w:tblPrEx>
         <w:tc>
           <w:tcPr>
             <w:tcW w:w="4500" w:type="dxa"/>
@@ -2891,12 +2995,6 @@
         </w:tc>
       </w:tr>
       <w:tr>
-        <w:tblPrEx>
-          <w:tblCellMar>
-            <w:top w:w="0" w:type="dxa"/>
-            <w:bottom w:w="0" w:type="dxa"/>
-          </w:tblCellMar>
-        </w:tblPrEx>
         <w:tc>
           <w:tcPr>
             <w:tcW w:w="4500" w:type="dxa"/>
@@ -2941,12 +3039,6 @@
         </w:tc>
       </w:tr>
       <w:tr>
-        <w:tblPrEx>
-          <w:tblCellMar>
-            <w:top w:w="0" w:type="dxa"/>
-            <w:bottom w:w="0" w:type="dxa"/>
-          </w:tblCellMar>
-        </w:tblPrEx>
         <w:tc>
           <w:tcPr>
             <w:tcW w:w="4500" w:type="dxa"/>
@@ -2991,12 +3083,6 @@
         </w:tc>
       </w:tr>
       <w:tr>
-        <w:tblPrEx>
-          <w:tblCellMar>
-            <w:top w:w="0" w:type="dxa"/>
-            <w:bottom w:w="0" w:type="dxa"/>
-          </w:tblCellMar>
-        </w:tblPrEx>
         <w:tc>
           <w:tcPr>
             <w:tcW w:w="4500" w:type="dxa"/>
@@ -3041,12 +3127,6 @@
         </w:tc>
       </w:tr>
       <w:tr>
-        <w:tblPrEx>
-          <w:tblCellMar>
-            <w:top w:w="0" w:type="dxa"/>
-            <w:bottom w:w="0" w:type="dxa"/>
-          </w:tblCellMar>
-        </w:tblPrEx>
         <w:tc>
           <w:tcPr>
             <w:tcW w:w="4500" w:type="dxa"/>
@@ -3091,12 +3171,6 @@
         </w:tc>
       </w:tr>
       <w:tr>
-        <w:tblPrEx>
-          <w:tblCellMar>
-            <w:top w:w="0" w:type="dxa"/>
-            <w:bottom w:w="0" w:type="dxa"/>
-          </w:tblCellMar>
-        </w:tblPrEx>
         <w:tc>
           <w:tcPr>
             <w:tcW w:w="4500" w:type="dxa"/>
@@ -3141,12 +3215,6 @@
         </w:tc>
       </w:tr>
       <w:tr>
-        <w:tblPrEx>
-          <w:tblCellMar>
-            <w:top w:w="0" w:type="dxa"/>
-            <w:bottom w:w="0" w:type="dxa"/>
-          </w:tblCellMar>
-        </w:tblPrEx>
         <w:tc>
           <w:tcPr>
             <w:tcW w:w="4500" w:type="dxa"/>
@@ -3200,6 +3268,21 @@
       <w:pPr>
         <w:spacing w:after="160" w:line="276" w:lineRule="auto"/>
         <w:jc w:val="both"/>
+        <w:rPr>
+          <w:color w:val="222222"/>
+        </w:rPr>
+      </w:pPr>
+      <w:r>
+        <w:rPr>
+          <w:color w:val="222222"/>
+        </w:rPr>
+        <w:t>In addition to masking, deterministic salted SHA-256 tokens are generated for email addresses and phone numbers. These irreversible surrogate identifiers allow analytical joins without exposing the original values.</w:t>
+      </w:r>
+    </w:p>
+    <w:p>
+      <w:pPr>
+        <w:spacing w:after="160" w:line="276" w:lineRule="auto"/>
+        <w:jc w:val="both"/>
       </w:pPr>
       <w:r>
         <w:rPr>
@@ -3286,21 +3369,10 @@
         </w:rPr>
         <w:t>The following analytical transformations are performed:</w:t>
       </w:r>
-    </w:p>
-    <w:p>
-      <w:pPr>
-        <w:pStyle w:val="ListParagraph"/>
-        <w:numPr>
-          <w:ilvl w:val="0"/>
-          <w:numId w:val="2"/>
-        </w:numPr>
-        <w:spacing w:after="100" w:line="276" w:lineRule="auto"/>
-        <w:jc w:val="both"/>
-      </w:pPr>
-      <w:r>
-        <w:rPr>
-          <w:color w:val="222222"/>
-        </w:rPr>
+      <w:r>
+        <w:t xml:space="preserve"> </w:t>
+      </w:r>
+      <w:r>
         <w:t>Customer age calculation</w:t>
       </w:r>
     </w:p>
@@ -3309,15 +3381,12 @@
         <w:pStyle w:val="ListParagraph"/>
         <w:numPr>
           <w:ilvl w:val="0"/>
-          <w:numId w:val="2"/>
-        </w:numPr>
-        <w:spacing w:after="100" w:line="276" w:lineRule="auto"/>
-        <w:jc w:val="both"/>
-      </w:pPr>
-      <w:r>
-        <w:rPr>
-          <w:color w:val="222222"/>
-        </w:rPr>
+          <w:numId w:val="3"/>
+        </w:numPr>
+        <w:spacing w:line="276" w:lineRule="auto"/>
+        <w:jc w:val="both"/>
+      </w:pPr>
+      <w:r>
         <w:t>Age group generation</w:t>
       </w:r>
     </w:p>
@@ -3326,15 +3395,40 @@
         <w:pStyle w:val="ListParagraph"/>
         <w:numPr>
           <w:ilvl w:val="0"/>
-          <w:numId w:val="2"/>
-        </w:numPr>
-        <w:spacing w:after="100" w:line="276" w:lineRule="auto"/>
-        <w:jc w:val="both"/>
-      </w:pPr>
-      <w:r>
-        <w:rPr>
-          <w:color w:val="222222"/>
-        </w:rPr>
+          <w:numId w:val="3"/>
+        </w:numPr>
+        <w:spacing w:line="276" w:lineRule="auto"/>
+        <w:jc w:val="both"/>
+      </w:pPr>
+      <w:r>
+        <w:t>Removal of exact date of birth</w:t>
+      </w:r>
+    </w:p>
+    <w:p>
+      <w:pPr>
+        <w:pStyle w:val="ListParagraph"/>
+        <w:numPr>
+          <w:ilvl w:val="0"/>
+          <w:numId w:val="3"/>
+        </w:numPr>
+        <w:spacing w:line="276" w:lineRule="auto"/>
+        <w:jc w:val="both"/>
+      </w:pPr>
+      <w:r>
+        <w:t>Postal code generalization</w:t>
+      </w:r>
+    </w:p>
+    <w:p>
+      <w:pPr>
+        <w:pStyle w:val="ListParagraph"/>
+        <w:numPr>
+          <w:ilvl w:val="0"/>
+          <w:numId w:val="3"/>
+        </w:numPr>
+        <w:spacing w:line="276" w:lineRule="auto"/>
+        <w:jc w:val="both"/>
+      </w:pPr>
+      <w:r>
         <w:t>Transaction amount bucketing</w:t>
       </w:r>
     </w:p>
@@ -3343,15 +3437,12 @@
         <w:pStyle w:val="ListParagraph"/>
         <w:numPr>
           <w:ilvl w:val="0"/>
-          <w:numId w:val="2"/>
-        </w:numPr>
-        <w:spacing w:after="100" w:line="276" w:lineRule="auto"/>
-        <w:jc w:val="both"/>
-      </w:pPr>
-      <w:r>
-        <w:rPr>
-          <w:color w:val="222222"/>
-        </w:rPr>
+          <w:numId w:val="3"/>
+        </w:numPr>
+        <w:spacing w:line="276" w:lineRule="auto"/>
+        <w:jc w:val="both"/>
+      </w:pPr>
+      <w:r>
         <w:t>Customer summary generation</w:t>
       </w:r>
     </w:p>
@@ -3360,15 +3451,12 @@
         <w:pStyle w:val="ListParagraph"/>
         <w:numPr>
           <w:ilvl w:val="0"/>
-          <w:numId w:val="2"/>
-        </w:numPr>
-        <w:spacing w:after="100" w:line="276" w:lineRule="auto"/>
-        <w:jc w:val="both"/>
-      </w:pPr>
-      <w:r>
-        <w:rPr>
-          <w:color w:val="222222"/>
-        </w:rPr>
+          <w:numId w:val="3"/>
+        </w:numPr>
+        <w:spacing w:after="160" w:line="276" w:lineRule="auto"/>
+        <w:jc w:val="both"/>
+      </w:pPr>
+      <w:r>
         <w:t>Sales summary generation</w:t>
       </w:r>
     </w:p>
@@ -3378,9 +3466,32 @@
         <w:jc w:val="both"/>
       </w:pPr>
       <w:r>
-        <w:rPr>
-          <w:color w:val="222222"/>
-        </w:rPr>
+        <w:t xml:space="preserve">Following feature engineering, the original </w:t>
+      </w:r>
+      <w:proofErr w:type="spellStart"/>
+      <w:r>
+        <w:t>date_of_birth</w:t>
+      </w:r>
+      <w:proofErr w:type="spellEnd"/>
+      <w:r>
+        <w:t xml:space="preserve"> column is removed and postal codes are generalized to reduce re-identification risk while preserving analytical </w:t>
+      </w:r>
+      <w:proofErr w:type="spellStart"/>
+      <w:r>
+        <w:t>usefulnes</w:t>
+      </w:r>
+      <w:proofErr w:type="spellEnd"/>
+    </w:p>
+    <w:p>
+      <w:pPr>
+        <w:spacing w:after="160" w:line="276" w:lineRule="auto"/>
+        <w:jc w:val="both"/>
+      </w:pPr>
+      <w:r>
+        <w:rPr>
+          <w:color w:val="222222"/>
+        </w:rPr>
+        <w:lastRenderedPageBreak/>
         <w:t>These transformations convert operational retail data into datasets suitable for reporting, dashboarding, and business intelligence.</w:t>
       </w:r>
     </w:p>
@@ -3427,7 +3538,6 @@
         <w:rPr>
           <w:color w:val="222222"/>
         </w:rPr>
-        <w:lastRenderedPageBreak/>
         <w:t>transactions_gold.csv</w:t>
       </w:r>
     </w:p>
@@ -4085,12 +4195,27 @@
       <w:pPr>
         <w:spacing w:after="160" w:line="276" w:lineRule="auto"/>
         <w:jc w:val="both"/>
-      </w:pPr>
-      <w:r>
-        <w:rPr>
-          <w:color w:val="222222"/>
-        </w:rPr>
-        <w:t>The Bronze Layer removed highly sensitive payment information and enriched the datasets with ingestion metadata. The Silver Layer applied masking and redaction techniques to protect Personally Identifiable Information (PII), ensuring that customer identities remained confidential while preserving analytical value. Finally, the Gold Layer generated business-ready datasets by performing feature engineering and aggregation.</w:t>
+        <w:rPr>
+          <w:color w:val="222222"/>
+        </w:rPr>
+      </w:pPr>
+      <w:r>
+        <w:rPr>
+          <w:color w:val="222222"/>
+        </w:rPr>
+        <w:t>The Bronze Layer removed highly sensitive payment information and enriched the datasets with ingestion metadata</w:t>
+      </w:r>
+      <w:r>
+        <w:rPr>
+          <w:color w:val="222222"/>
+        </w:rPr>
+        <w:t xml:space="preserve">. </w:t>
+      </w:r>
+      <w:r>
+        <w:rPr>
+          <w:color w:val="222222"/>
+        </w:rPr>
+        <w:t>The Silver Layer applied masking, redaction, and cryptographic tokenization to protect customer identifiers while preserving analytical consistency. The Gold Layer further enhanced privacy by removing exact dates of birth after deriving age groups and generalizing postal codes before analytical storage.</w:t>
       </w:r>
     </w:p>
     <w:p>
@@ -4162,12 +4287,6 @@
         <w:gridCol w:w="2800"/>
       </w:tblGrid>
       <w:tr>
-        <w:tblPrEx>
-          <w:tblCellMar>
-            <w:top w:w="0" w:type="dxa"/>
-            <w:bottom w:w="0" w:type="dxa"/>
-          </w:tblCellMar>
-        </w:tblPrEx>
         <w:tc>
           <w:tcPr>
             <w:tcW w:w="6200" w:type="dxa"/>
@@ -4220,12 +4339,6 @@
         </w:tc>
       </w:tr>
       <w:tr>
-        <w:tblPrEx>
-          <w:tblCellMar>
-            <w:top w:w="0" w:type="dxa"/>
-            <w:bottom w:w="0" w:type="dxa"/>
-          </w:tblCellMar>
-        </w:tblPrEx>
         <w:tc>
           <w:tcPr>
             <w:tcW w:w="6200" w:type="dxa"/>
@@ -4273,12 +4386,6 @@
         </w:tc>
       </w:tr>
       <w:tr>
-        <w:tblPrEx>
-          <w:tblCellMar>
-            <w:top w:w="0" w:type="dxa"/>
-            <w:bottom w:w="0" w:type="dxa"/>
-          </w:tblCellMar>
-        </w:tblPrEx>
         <w:tc>
           <w:tcPr>
             <w:tcW w:w="6200" w:type="dxa"/>
@@ -4326,12 +4433,6 @@
         </w:tc>
       </w:tr>
       <w:tr>
-        <w:tblPrEx>
-          <w:tblCellMar>
-            <w:top w:w="0" w:type="dxa"/>
-            <w:bottom w:w="0" w:type="dxa"/>
-          </w:tblCellMar>
-        </w:tblPrEx>
         <w:tc>
           <w:tcPr>
             <w:tcW w:w="6200" w:type="dxa"/>
@@ -4379,12 +4480,6 @@
         </w:tc>
       </w:tr>
       <w:tr>
-        <w:tblPrEx>
-          <w:tblCellMar>
-            <w:top w:w="0" w:type="dxa"/>
-            <w:bottom w:w="0" w:type="dxa"/>
-          </w:tblCellMar>
-        </w:tblPrEx>
         <w:tc>
           <w:tcPr>
             <w:tcW w:w="6200" w:type="dxa"/>
@@ -4432,12 +4527,6 @@
         </w:tc>
       </w:tr>
       <w:tr>
-        <w:tblPrEx>
-          <w:tblCellMar>
-            <w:top w:w="0" w:type="dxa"/>
-            <w:bottom w:w="0" w:type="dxa"/>
-          </w:tblCellMar>
-        </w:tblPrEx>
         <w:tc>
           <w:tcPr>
             <w:tcW w:w="6200" w:type="dxa"/>
@@ -4485,12 +4574,6 @@
         </w:tc>
       </w:tr>
       <w:tr>
-        <w:tblPrEx>
-          <w:tblCellMar>
-            <w:top w:w="0" w:type="dxa"/>
-            <w:bottom w:w="0" w:type="dxa"/>
-          </w:tblCellMar>
-        </w:tblPrEx>
         <w:tc>
           <w:tcPr>
             <w:tcW w:w="6200" w:type="dxa"/>
@@ -4538,12 +4621,6 @@
         </w:tc>
       </w:tr>
       <w:tr>
-        <w:tblPrEx>
-          <w:tblCellMar>
-            <w:top w:w="0" w:type="dxa"/>
-            <w:bottom w:w="0" w:type="dxa"/>
-          </w:tblCellMar>
-        </w:tblPrEx>
         <w:tc>
           <w:tcPr>
             <w:tcW w:w="6200" w:type="dxa"/>
@@ -4591,12 +4668,6 @@
         </w:tc>
       </w:tr>
       <w:tr>
-        <w:tblPrEx>
-          <w:tblCellMar>
-            <w:top w:w="0" w:type="dxa"/>
-            <w:bottom w:w="0" w:type="dxa"/>
-          </w:tblCellMar>
-        </w:tblPrEx>
         <w:tc>
           <w:tcPr>
             <w:tcW w:w="6200" w:type="dxa"/>
@@ -4644,12 +4715,6 @@
         </w:tc>
       </w:tr>
       <w:tr>
-        <w:tblPrEx>
-          <w:tblCellMar>
-            <w:top w:w="0" w:type="dxa"/>
-            <w:bottom w:w="0" w:type="dxa"/>
-          </w:tblCellMar>
-        </w:tblPrEx>
         <w:tc>
           <w:tcPr>
             <w:tcW w:w="6200" w:type="dxa"/>
@@ -5196,14 +5261,21 @@
     </w:p>
     <w:p>
       <w:pPr>
-        <w:spacing w:after="160" w:line="276" w:lineRule="auto"/>
-        <w:jc w:val="both"/>
-      </w:pPr>
-      <w:r>
-        <w:rPr>
-          <w:color w:val="222222"/>
-        </w:rPr>
-        <w:t>Implementing data masking while preserving analytical usefulness required balancing security and business requirements. Sensitive customer information was masked or redacted without affecting downstream aggregation and reporting.</w:t>
+        <w:pStyle w:val="Heading3"/>
+        <w:spacing w:before="200" w:after="100"/>
+        <w:rPr>
+          <w:b w:val="0"/>
+          <w:bCs w:val="0"/>
+          <w:color w:val="222222"/>
+        </w:rPr>
+      </w:pPr>
+      <w:r>
+        <w:rPr>
+          <w:b w:val="0"/>
+          <w:bCs w:val="0"/>
+          <w:color w:val="222222"/>
+        </w:rPr>
+        <w:t>Implementing privacy-preserving transformations while maintaining analytical usability required balancing masking, cryptographic tokenization, redaction, and feature engineering without affecting downstream processing.</w:t>
       </w:r>
     </w:p>
     <w:p>
@@ -5352,15 +5424,125 @@
           <w:ilvl w:val="0"/>
           <w:numId w:val="2"/>
         </w:numPr>
-        <w:spacing w:after="100" w:line="276" w:lineRule="auto"/>
-        <w:jc w:val="both"/>
-      </w:pPr>
-      <w:r>
-        <w:rPr>
-          <w:color w:val="222222"/>
-        </w:rPr>
-        <w:t>Implementing Hard Drop, Masking, and Redaction strategies.</w:t>
-      </w:r>
+        <w:tabs>
+          <w:tab w:val="left" w:pos="916"/>
+          <w:tab w:val="left" w:pos="1832"/>
+          <w:tab w:val="left" w:pos="2748"/>
+          <w:tab w:val="left" w:pos="3664"/>
+          <w:tab w:val="left" w:pos="4580"/>
+          <w:tab w:val="left" w:pos="5496"/>
+          <w:tab w:val="left" w:pos="6412"/>
+          <w:tab w:val="left" w:pos="7328"/>
+          <w:tab w:val="left" w:pos="8244"/>
+          <w:tab w:val="left" w:pos="9160"/>
+          <w:tab w:val="left" w:pos="10076"/>
+          <w:tab w:val="left" w:pos="10992"/>
+          <w:tab w:val="left" w:pos="11908"/>
+          <w:tab w:val="left" w:pos="12824"/>
+          <w:tab w:val="left" w:pos="13740"/>
+          <w:tab w:val="left" w:pos="14656"/>
+        </w:tabs>
+        <w:rPr>
+          <w:rFonts w:asciiTheme="minorHAnsi" w:eastAsia="Times New Roman" w:hAnsiTheme="minorHAnsi" w:cstheme="minorHAnsi"/>
+        </w:rPr>
+      </w:pPr>
+      <w:r>
+        <w:rPr>
+          <w:rFonts w:asciiTheme="minorHAnsi" w:eastAsia="Times New Roman" w:hAnsiTheme="minorHAnsi" w:cstheme="minorHAnsi"/>
+        </w:rPr>
+        <w:t>Hard Drop</w:t>
+      </w:r>
+      <w:r>
+        <w:rPr>
+          <w:rFonts w:asciiTheme="minorHAnsi" w:eastAsia="Times New Roman" w:hAnsiTheme="minorHAnsi" w:cstheme="minorHAnsi"/>
+        </w:rPr>
+        <w:t xml:space="preserve">, </w:t>
+      </w:r>
+      <w:r>
+        <w:rPr>
+          <w:rFonts w:asciiTheme="minorHAnsi" w:eastAsia="Times New Roman" w:hAnsiTheme="minorHAnsi" w:cstheme="minorHAnsi"/>
+        </w:rPr>
+        <w:t>Masking</w:t>
+      </w:r>
+      <w:r>
+        <w:rPr>
+          <w:rFonts w:asciiTheme="minorHAnsi" w:eastAsia="Times New Roman" w:hAnsiTheme="minorHAnsi" w:cstheme="minorHAnsi"/>
+        </w:rPr>
+        <w:t xml:space="preserve">, </w:t>
+      </w:r>
+      <w:proofErr w:type="gramStart"/>
+      <w:r>
+        <w:rPr>
+          <w:rFonts w:asciiTheme="minorHAnsi" w:eastAsia="Times New Roman" w:hAnsiTheme="minorHAnsi" w:cstheme="minorHAnsi"/>
+        </w:rPr>
+        <w:t>Redaction</w:t>
+      </w:r>
+      <w:r>
+        <w:rPr>
+          <w:rFonts w:asciiTheme="minorHAnsi" w:eastAsia="Times New Roman" w:hAnsiTheme="minorHAnsi" w:cstheme="minorHAnsi"/>
+        </w:rPr>
+        <w:t>,</w:t>
+      </w:r>
+      <w:r>
+        <w:rPr>
+          <w:rFonts w:asciiTheme="minorHAnsi" w:eastAsia="Times New Roman" w:hAnsiTheme="minorHAnsi" w:cstheme="minorHAnsi"/>
+        </w:rPr>
+        <w:t>SHA</w:t>
+      </w:r>
+      <w:proofErr w:type="gramEnd"/>
+      <w:r>
+        <w:rPr>
+          <w:rFonts w:asciiTheme="minorHAnsi" w:eastAsia="Times New Roman" w:hAnsiTheme="minorHAnsi" w:cstheme="minorHAnsi"/>
+        </w:rPr>
+        <w:t>-256 Cryptographic Tokenization</w:t>
+      </w:r>
+      <w:r>
+        <w:rPr>
+          <w:rFonts w:asciiTheme="minorHAnsi" w:eastAsia="Times New Roman" w:hAnsiTheme="minorHAnsi" w:cstheme="minorHAnsi"/>
+        </w:rPr>
+        <w:t xml:space="preserve">, </w:t>
+      </w:r>
+      <w:r>
+        <w:rPr>
+          <w:rFonts w:asciiTheme="minorHAnsi" w:eastAsia="Times New Roman" w:hAnsiTheme="minorHAnsi" w:cstheme="minorHAnsi"/>
+        </w:rPr>
+        <w:t>Environment Variable Management using python-</w:t>
+      </w:r>
+      <w:proofErr w:type="spellStart"/>
+      <w:r>
+        <w:rPr>
+          <w:rFonts w:asciiTheme="minorHAnsi" w:eastAsia="Times New Roman" w:hAnsiTheme="minorHAnsi" w:cstheme="minorHAnsi"/>
+        </w:rPr>
+        <w:t>dotenv</w:t>
+      </w:r>
+      <w:proofErr w:type="spellEnd"/>
+    </w:p>
+    <w:p>
+      <w:pPr>
+        <w:pStyle w:val="ListParagraph"/>
+        <w:tabs>
+          <w:tab w:val="left" w:pos="916"/>
+          <w:tab w:val="left" w:pos="1832"/>
+          <w:tab w:val="left" w:pos="2748"/>
+          <w:tab w:val="left" w:pos="3664"/>
+          <w:tab w:val="left" w:pos="4580"/>
+          <w:tab w:val="left" w:pos="5496"/>
+          <w:tab w:val="left" w:pos="6412"/>
+          <w:tab w:val="left" w:pos="7328"/>
+          <w:tab w:val="left" w:pos="8244"/>
+          <w:tab w:val="left" w:pos="9160"/>
+          <w:tab w:val="left" w:pos="10076"/>
+          <w:tab w:val="left" w:pos="10992"/>
+          <w:tab w:val="left" w:pos="11908"/>
+          <w:tab w:val="left" w:pos="12824"/>
+          <w:tab w:val="left" w:pos="13740"/>
+          <w:tab w:val="left" w:pos="14656"/>
+        </w:tabs>
+        <w:ind w:left="460"/>
+        <w:rPr>
+          <w:rFonts w:asciiTheme="minorHAnsi" w:eastAsia="Times New Roman" w:hAnsiTheme="minorHAnsi" w:cstheme="minorHAnsi"/>
+        </w:rPr>
+      </w:pPr>
     </w:p>
     <w:p>
       <w:pPr>
@@ -5790,12 +5972,30 @@
       <w:pPr>
         <w:spacing w:after="160" w:line="276" w:lineRule="auto"/>
         <w:jc w:val="both"/>
+        <w:rPr>
+          <w:color w:val="222222"/>
+        </w:rPr>
       </w:pPr>
       <w:r>
         <w:rPr>
           <w:color w:val="222222"/>
         </w:rPr>
         <w:t>Overall, the Secure Retail Data Lakehouse achieves the defined project objectives and provides a strong foundation for future enhancements involving cloud technologies, distributed processing, and workflow orchestration.</w:t>
+      </w:r>
+    </w:p>
+    <w:p>
+      <w:pPr>
+        <w:spacing w:after="160" w:line="276" w:lineRule="auto"/>
+        <w:jc w:val="both"/>
+        <w:rPr>
+          <w:color w:val="222222"/>
+        </w:rPr>
+      </w:pPr>
+      <w:r>
+        <w:rPr>
+          <w:color w:val="222222"/>
+        </w:rPr>
+        <w:t>The completed implementation demonstrates how multiple privacy-preserving techniques—including Hard Drop, masking, redaction, cryptographic tokenization, and data generalization—can be integrated into a layered ETL pipeline to produce analytics-ready datasets without exposing sensitive customer information. Along with PostgreSQL integration and automated reporting, the project provides a practical demonstration of industry-inspired Data Engineering concepts while remaining suitable for internship-level implementation.</w:t>
       </w:r>
     </w:p>
     <w:p>
@@ -6241,6 +6441,119 @@
       </w:pPr>
     </w:lvl>
   </w:abstractNum>
+  <w:abstractNum w:abstractNumId="2" w15:restartNumberingAfterBreak="0">
+    <w:nsid w:val="49673BAD"/>
+    <w:multiLevelType w:val="hybridMultilevel"/>
+    <w:tmpl w:val="52E8EAAE"/>
+    <w:lvl w:ilvl="0" w:tplc="40090001">
+      <w:start w:val="1"/>
+      <w:numFmt w:val="bullet"/>
+      <w:lvlText w:val=""/>
+      <w:lvlJc w:val="left"/>
+      <w:pPr>
+        <w:ind w:left="720" w:hanging="360"/>
+      </w:pPr>
+      <w:rPr>
+        <w:rFonts w:ascii="Symbol" w:hAnsi="Symbol" w:hint="default"/>
+      </w:rPr>
+    </w:lvl>
+    <w:lvl w:ilvl="1" w:tplc="40090003" w:tentative="1">
+      <w:start w:val="1"/>
+      <w:numFmt w:val="bullet"/>
+      <w:lvlText w:val="o"/>
+      <w:lvlJc w:val="left"/>
+      <w:pPr>
+        <w:ind w:left="1440" w:hanging="360"/>
+      </w:pPr>
+      <w:rPr>
+        <w:rFonts w:ascii="Courier New" w:hAnsi="Courier New" w:cs="Courier New" w:hint="default"/>
+      </w:rPr>
+    </w:lvl>
+    <w:lvl w:ilvl="2" w:tplc="40090005" w:tentative="1">
+      <w:start w:val="1"/>
+      <w:numFmt w:val="bullet"/>
+      <w:lvlText w:val=""/>
+      <w:lvlJc w:val="left"/>
+      <w:pPr>
+        <w:ind w:left="2160" w:hanging="360"/>
+      </w:pPr>
+      <w:rPr>
+        <w:rFonts w:ascii="Wingdings" w:hAnsi="Wingdings" w:hint="default"/>
+      </w:rPr>
+    </w:lvl>
+    <w:lvl w:ilvl="3" w:tplc="40090001" w:tentative="1">
+      <w:start w:val="1"/>
+      <w:numFmt w:val="bullet"/>
+      <w:lvlText w:val=""/>
+      <w:lvlJc w:val="left"/>
+      <w:pPr>
+        <w:ind w:left="2880" w:hanging="360"/>
+      </w:pPr>
+      <w:rPr>
+        <w:rFonts w:ascii="Symbol" w:hAnsi="Symbol" w:hint="default"/>
+      </w:rPr>
+    </w:lvl>
+    <w:lvl w:ilvl="4" w:tplc="40090003" w:tentative="1">
+      <w:start w:val="1"/>
+      <w:numFmt w:val="bullet"/>
+      <w:lvlText w:val="o"/>
+      <w:lvlJc w:val="left"/>
+      <w:pPr>
+        <w:ind w:left="3600" w:hanging="360"/>
+      </w:pPr>
+      <w:rPr>
+        <w:rFonts w:ascii="Courier New" w:hAnsi="Courier New" w:cs="Courier New" w:hint="default"/>
+      </w:rPr>
+    </w:lvl>
+    <w:lvl w:ilvl="5" w:tplc="40090005" w:tentative="1">
+      <w:start w:val="1"/>
+      <w:numFmt w:val="bullet"/>
+      <w:lvlText w:val=""/>
+      <w:lvlJc w:val="left"/>
+      <w:pPr>
+        <w:ind w:left="4320" w:hanging="360"/>
+      </w:pPr>
+      <w:rPr>
+        <w:rFonts w:ascii="Wingdings" w:hAnsi="Wingdings" w:hint="default"/>
+      </w:rPr>
+    </w:lvl>
+    <w:lvl w:ilvl="6" w:tplc="40090001" w:tentative="1">
+      <w:start w:val="1"/>
+      <w:numFmt w:val="bullet"/>
+      <w:lvlText w:val=""/>
+      <w:lvlJc w:val="left"/>
+      <w:pPr>
+        <w:ind w:left="5040" w:hanging="360"/>
+      </w:pPr>
+      <w:rPr>
+        <w:rFonts w:ascii="Symbol" w:hAnsi="Symbol" w:hint="default"/>
+      </w:rPr>
+    </w:lvl>
+    <w:lvl w:ilvl="7" w:tplc="40090003" w:tentative="1">
+      <w:start w:val="1"/>
+      <w:numFmt w:val="bullet"/>
+      <w:lvlText w:val="o"/>
+      <w:lvlJc w:val="left"/>
+      <w:pPr>
+        <w:ind w:left="5760" w:hanging="360"/>
+      </w:pPr>
+      <w:rPr>
+        <w:rFonts w:ascii="Courier New" w:hAnsi="Courier New" w:cs="Courier New" w:hint="default"/>
+      </w:rPr>
+    </w:lvl>
+    <w:lvl w:ilvl="8" w:tplc="40090005" w:tentative="1">
+      <w:start w:val="1"/>
+      <w:numFmt w:val="bullet"/>
+      <w:lvlText w:val=""/>
+      <w:lvlJc w:val="left"/>
+      <w:pPr>
+        <w:ind w:left="6480" w:hanging="360"/>
+      </w:pPr>
+      <w:rPr>
+        <w:rFonts w:ascii="Wingdings" w:hAnsi="Wingdings" w:hint="default"/>
+      </w:rPr>
+    </w:lvl>
+  </w:abstractNum>
   <w:num w:numId="1" w16cid:durableId="1625887298">
     <w:abstractNumId w:val="1"/>
     <w:lvlOverride w:ilvl="0">
@@ -6252,6 +6565,9 @@
     <w:lvlOverride w:ilvl="0">
       <w:startOverride w:val="1"/>
     </w:lvlOverride>
+  </w:num>
+  <w:num w:numId="3" w16cid:durableId="1278565623">
+    <w:abstractNumId w:val="2"/>
   </w:num>
 </w:numbering>
 </file>
@@ -6745,7 +7061,6 @@
   <w:style w:type="character" w:default="1" w:styleId="DefaultParagraphFont">
     <w:name w:val="Default Paragraph Font"/>
     <w:uiPriority w:val="1"/>
-    <w:semiHidden/>
     <w:unhideWhenUsed/>
   </w:style>
   <w:style w:type="table" w:default="1" w:styleId="TableNormal">
@@ -6857,6 +7172,79 @@
     <w:semiHidden/>
     <w:unhideWhenUsed/>
     <w:rPr>
+      <w:sz w:val="20"/>
+      <w:szCs w:val="20"/>
+    </w:rPr>
+  </w:style>
+  <w:style w:type="paragraph" w:styleId="NormalWeb">
+    <w:name w:val="Normal (Web)"/>
+    <w:basedOn w:val="Normal"/>
+    <w:uiPriority w:val="99"/>
+    <w:semiHidden/>
+    <w:unhideWhenUsed/>
+    <w:rsid w:val="00FE592A"/>
+    <w:rPr>
+      <w:rFonts w:ascii="Times New Roman" w:hAnsi="Times New Roman" w:cs="Times New Roman"/>
+      <w:sz w:val="24"/>
+      <w:szCs w:val="24"/>
+    </w:rPr>
+  </w:style>
+  <w:style w:type="paragraph" w:styleId="HTMLPreformatted">
+    <w:name w:val="HTML Preformatted"/>
+    <w:basedOn w:val="Normal"/>
+    <w:link w:val="HTMLPreformattedChar"/>
+    <w:uiPriority w:val="99"/>
+    <w:semiHidden/>
+    <w:unhideWhenUsed/>
+    <w:rsid w:val="00F279B6"/>
+    <w:pPr>
+      <w:tabs>
+        <w:tab w:val="left" w:pos="916"/>
+        <w:tab w:val="left" w:pos="1832"/>
+        <w:tab w:val="left" w:pos="2748"/>
+        <w:tab w:val="left" w:pos="3664"/>
+        <w:tab w:val="left" w:pos="4580"/>
+        <w:tab w:val="left" w:pos="5496"/>
+        <w:tab w:val="left" w:pos="6412"/>
+        <w:tab w:val="left" w:pos="7328"/>
+        <w:tab w:val="left" w:pos="8244"/>
+        <w:tab w:val="left" w:pos="9160"/>
+        <w:tab w:val="left" w:pos="10076"/>
+        <w:tab w:val="left" w:pos="10992"/>
+        <w:tab w:val="left" w:pos="11908"/>
+        <w:tab w:val="left" w:pos="12824"/>
+        <w:tab w:val="left" w:pos="13740"/>
+        <w:tab w:val="left" w:pos="14656"/>
+      </w:tabs>
+    </w:pPr>
+    <w:rPr>
+      <w:rFonts w:ascii="Courier New" w:eastAsia="Times New Roman" w:hAnsi="Courier New" w:cs="Courier New"/>
+      <w:sz w:val="20"/>
+      <w:szCs w:val="20"/>
+    </w:rPr>
+  </w:style>
+  <w:style w:type="character" w:customStyle="1" w:styleId="HTMLPreformattedChar">
+    <w:name w:val="HTML Preformatted Char"/>
+    <w:basedOn w:val="DefaultParagraphFont"/>
+    <w:link w:val="HTMLPreformatted"/>
+    <w:uiPriority w:val="99"/>
+    <w:semiHidden/>
+    <w:rsid w:val="00F279B6"/>
+    <w:rPr>
+      <w:rFonts w:ascii="Courier New" w:eastAsia="Times New Roman" w:hAnsi="Courier New" w:cs="Courier New"/>
+      <w:sz w:val="20"/>
+      <w:szCs w:val="20"/>
+    </w:rPr>
+  </w:style>
+  <w:style w:type="character" w:styleId="HTMLCode">
+    <w:name w:val="HTML Code"/>
+    <w:basedOn w:val="DefaultParagraphFont"/>
+    <w:uiPriority w:val="99"/>
+    <w:semiHidden/>
+    <w:unhideWhenUsed/>
+    <w:rsid w:val="00F279B6"/>
+    <w:rPr>
+      <w:rFonts w:ascii="Courier New" w:eastAsia="Times New Roman" w:hAnsi="Courier New" w:cs="Courier New"/>
       <w:sz w:val="20"/>
       <w:szCs w:val="20"/>
     </w:rPr>

</xml_diff>